<commit_message>
Added UI Screenshots to Docx
</commit_message>
<xml_diff>
--- a/Piyush_Hotel_Booking_Project_Report.docx
+++ b/Piyush_Hotel_Booking_Project_Report.docx
@@ -5167,6 +5167,285 @@
           <w:i w:val="0"/>
         </w:rPr>
         <w:t>Run with: streamlit run dashboard/app.py</w:t>
+      </w:r>
+    </w:p>
+    <w:p>
+      <w:pPr>
+        <w:pStyle w:val="Heading2"/>
+        <w:spacing w:before="240" w:after="120"/>
+      </w:pPr>
+      <w:r>
+        <w:rPr/>
+        <w:t xml:space="preserve">13.1 Dashboard UI Screenshots</w:t>
+      </w:r>
+    </w:p>
+    <w:p>
+      <w:pPr>
+        <w:spacing w:after="160"/>
+      </w:pPr>
+      <w:r>
+        <w:rPr/>
+        <w:t xml:space="preserve">The following screenshots show the actual rendered output of all four dashboard pages. The dashboard is built with Streamlit and uses a dark theme optimised for data visualisation.</w:t>
+      </w:r>
+    </w:p>
+    <w:p>
+      <w:pPr>
+        <w:spacing w:before="160" w:after="80"/>
+      </w:pPr>
+      <w:r>
+        <w:rPr>
+          <w:b/>
+        </w:rPr>
+        <w:t xml:space="preserve">Page 1 — Executive Overview</w:t>
+      </w:r>
+    </w:p>
+    <w:p>
+      <w:pPr>
+        <w:spacing w:line="240" w:lineRule="auto"/>
+      </w:pPr>
+      <w:r>
+        <w:drawing>
+          <wp:inline distT="0" distB="0" distL="0" distR="0">
+            <wp:extent cx="5580000" cy="3356413"/>
+            <wp:effectExtent l="0" t="0" r="0" b="0"/>
+            <wp:docPr id="7" name="dashboard_page1_overview.png" descr=""/>
+            <wp:cNvGraphicFramePr>
+              <a:graphicFrameLocks noChangeAspect="1"/>
+            </wp:cNvGraphicFramePr>
+            <a:graphic>
+              <a:graphicData uri="http://schemas.openxmlformats.org/drawingml/2006/picture">
+                <pic:pic>
+                  <pic:nvPicPr>
+                    <pic:cNvPr id="7" name="dashboard_page1_overview.png"/>
+                    <pic:cNvPicPr/>
+                  </pic:nvPicPr>
+                  <pic:blipFill>
+                    <a:blip r:embed="R1336cc267db94bc1" cstate="print"/>
+                    <a:stretch>
+                      <a:fillRect/>
+                    </a:stretch>
+                  </pic:blipFill>
+                  <pic:spPr>
+                    <a:xfrm>
+                      <a:off x="0" y="0"/>
+                      <a:ext cx="5580000" cy="3356413"/>
+                    </a:xfrm>
+                    <a:prstGeom prst="rect">
+                      <a:avLst/>
+                    </a:prstGeom>
+                  </pic:spPr>
+                </pic:pic>
+              </a:graphicData>
+            </a:graphic>
+          </wp:inline>
+        </w:drawing>
+      </w:r>
+    </w:p>
+    <w:p>
+      <w:pPr>
+        <w:spacing w:after="200"/>
+        <w:jc w:val="center"/>
+      </w:pPr>
+      <w:r>
+        <w:rPr>
+          <w:i/>
+        </w:rPr>
+        <w:t xml:space="preserve">Figure 7: Page 1 — Executive Overview showing 8 KPI cards, cancellation distribution pie chart, hotel type comparison, and summary table.</w:t>
+      </w:r>
+    </w:p>
+    <w:p>
+      <w:pPr>
+        <w:spacing w:before="160" w:after="80"/>
+      </w:pPr>
+      <w:r>
+        <w:rPr>
+          <w:b/>
+        </w:rPr>
+        <w:t xml:space="preserve">Page 2 — Booking Analytics</w:t>
+      </w:r>
+    </w:p>
+    <w:p>
+      <w:pPr>
+        <w:spacing w:line="240" w:lineRule="auto"/>
+      </w:pPr>
+      <w:r>
+        <w:drawing>
+          <wp:inline distT="0" distB="0" distL="0" distR="0">
+            <wp:extent cx="5580000" cy="3421698"/>
+            <wp:effectExtent l="0" t="0" r="0" b="0"/>
+            <wp:docPr id="8" name="dashboard_page2_booking.png" descr=""/>
+            <wp:cNvGraphicFramePr>
+              <a:graphicFrameLocks noChangeAspect="1"/>
+            </wp:cNvGraphicFramePr>
+            <a:graphic>
+              <a:graphicData uri="http://schemas.openxmlformats.org/drawingml/2006/picture">
+                <pic:pic>
+                  <pic:nvPicPr>
+                    <pic:cNvPr id="8" name="dashboard_page2_booking.png"/>
+                    <pic:cNvPicPr/>
+                  </pic:nvPicPr>
+                  <pic:blipFill>
+                    <a:blip r:embed="R184d3c26478440f8" cstate="print"/>
+                    <a:stretch>
+                      <a:fillRect/>
+                    </a:stretch>
+                  </pic:blipFill>
+                  <pic:spPr>
+                    <a:xfrm>
+                      <a:off x="0" y="0"/>
+                      <a:ext cx="5580000" cy="3421698"/>
+                    </a:xfrm>
+                    <a:prstGeom prst="rect">
+                      <a:avLst/>
+                    </a:prstGeom>
+                  </pic:spPr>
+                </pic:pic>
+              </a:graphicData>
+            </a:graphic>
+          </wp:inline>
+        </w:drawing>
+      </w:r>
+    </w:p>
+    <w:p>
+      <w:pPr>
+        <w:spacing w:after="200"/>
+        <w:jc w:val="center"/>
+      </w:pPr>
+      <w:r>
+        <w:rPr>
+          <w:i/>
+        </w:rPr>
+        <w:t xml:space="preserve">Figure 8: Page 2 — Booking Analytics showing monthly demand trend, hotel type bookings, market segment breakdown, and monthly ADR trend.</w:t>
+      </w:r>
+    </w:p>
+    <w:p>
+      <w:pPr>
+        <w:spacing w:before="160" w:after="80"/>
+      </w:pPr>
+      <w:r>
+        <w:rPr>
+          <w:b/>
+        </w:rPr>
+        <w:t xml:space="preserve">Page 3 — Cancellation Analytics</w:t>
+      </w:r>
+    </w:p>
+    <w:p>
+      <w:pPr>
+        <w:spacing w:line="240" w:lineRule="auto"/>
+      </w:pPr>
+      <w:r>
+        <w:drawing>
+          <wp:inline distT="0" distB="0" distL="0" distR="0">
+            <wp:extent cx="5580000" cy="3420566"/>
+            <wp:effectExtent l="0" t="0" r="0" b="0"/>
+            <wp:docPr id="9" name="dashboard_page3_cancellation.png" descr=""/>
+            <wp:cNvGraphicFramePr>
+              <a:graphicFrameLocks noChangeAspect="1"/>
+            </wp:cNvGraphicFramePr>
+            <a:graphic>
+              <a:graphicData uri="http://schemas.openxmlformats.org/drawingml/2006/picture">
+                <pic:pic>
+                  <pic:nvPicPr>
+                    <pic:cNvPr id="9" name="dashboard_page3_cancellation.png"/>
+                    <pic:cNvPicPr/>
+                  </pic:nvPicPr>
+                  <pic:blipFill>
+                    <a:blip r:embed="Rd98f53adeb914e56" cstate="print"/>
+                    <a:stretch>
+                      <a:fillRect/>
+                    </a:stretch>
+                  </pic:blipFill>
+                  <pic:spPr>
+                    <a:xfrm>
+                      <a:off x="0" y="0"/>
+                      <a:ext cx="5580000" cy="3420566"/>
+                    </a:xfrm>
+                    <a:prstGeom prst="rect">
+                      <a:avLst/>
+                    </a:prstGeom>
+                  </pic:spPr>
+                </pic:pic>
+              </a:graphicData>
+            </a:graphic>
+          </wp:inline>
+        </w:drawing>
+      </w:r>
+    </w:p>
+    <w:p>
+      <w:pPr>
+        <w:spacing w:after="200"/>
+        <w:jc w:val="center"/>
+      </w:pPr>
+      <w:r>
+        <w:rPr>
+          <w:i/>
+        </w:rPr>
+        <w:t xml:space="preserve">Figure 9: Page 3 — Cancellation Analytics showing rates by deposit type, customer type, lead time bucket, and month.</w:t>
+      </w:r>
+    </w:p>
+    <w:p>
+      <w:pPr>
+        <w:spacing w:before="160" w:after="80"/>
+      </w:pPr>
+      <w:r>
+        <w:rPr>
+          <w:b/>
+        </w:rPr>
+        <w:t xml:space="preserve">Page 4 — ML Cancellation Prediction</w:t>
+      </w:r>
+    </w:p>
+    <w:p>
+      <w:pPr>
+        <w:spacing w:line="240" w:lineRule="auto"/>
+      </w:pPr>
+      <w:r>
+        <w:drawing>
+          <wp:inline distT="0" distB="0" distL="0" distR="0">
+            <wp:extent cx="5580000" cy="3335447"/>
+            <wp:effectExtent l="0" t="0" r="0" b="0"/>
+            <wp:docPr id="10" name="dashboard_page4_prediction.png" descr=""/>
+            <wp:cNvGraphicFramePr>
+              <a:graphicFrameLocks noChangeAspect="1"/>
+            </wp:cNvGraphicFramePr>
+            <a:graphic>
+              <a:graphicData uri="http://schemas.openxmlformats.org/drawingml/2006/picture">
+                <pic:pic>
+                  <pic:nvPicPr>
+                    <pic:cNvPr id="10" name="dashboard_page4_prediction.png"/>
+                    <pic:cNvPicPr/>
+                  </pic:nvPicPr>
+                  <pic:blipFill>
+                    <a:blip r:embed="R2dc47fdc2cea4eef" cstate="print"/>
+                    <a:stretch>
+                      <a:fillRect/>
+                    </a:stretch>
+                  </pic:blipFill>
+                  <pic:spPr>
+                    <a:xfrm>
+                      <a:off x="0" y="0"/>
+                      <a:ext cx="5580000" cy="3335447"/>
+                    </a:xfrm>
+                    <a:prstGeom prst="rect">
+                      <a:avLst/>
+                    </a:prstGeom>
+                  </pic:spPr>
+                </pic:pic>
+              </a:graphicData>
+            </a:graphic>
+          </wp:inline>
+        </w:drawing>
+      </w:r>
+    </w:p>
+    <w:p>
+      <w:pPr>
+        <w:spacing w:after="200"/>
+        <w:jc w:val="center"/>
+      </w:pPr>
+      <w:r>
+        <w:rPr>
+          <w:i/>
+        </w:rPr>
+        <w:t xml:space="preserve">Figure 10: Page 4 — ML Prediction showing the interactive booking form (left) alongside the live cancellation prediction result, probability bar, and key factors (right).</w:t>
       </w:r>
     </w:p>
     <w:p>

</xml_diff>